<commit_message>
Committing this change to demo what happens when the same file is changed by multiple connections
</commit_message>
<xml_diff>
--- a/GitHub Test One.docx
+++ b/GitHub Test One.docx
@@ -13,6 +13,11 @@
     <w:p>
       <w:r>
         <w:t>Adding a second sentence to this document…</w:t>
+      </w:r>
+    </w:p>
+    <w:p>
+      <w:r>
+        <w:t>Adding a third sentence to this document…</w:t>
       </w:r>
     </w:p>
     <w:sectPr>

</xml_diff>

<commit_message>
Have an update to push for fourth change
Have an update to push but someone made a change to the file from a different situation...
</commit_message>
<xml_diff>
--- a/GitHub Test One.docx
+++ b/GitHub Test One.docx
@@ -13,6 +13,11 @@
     <w:p>
       <w:r>
         <w:t>Adding a second sentence to this document…</w:t>
+      </w:r>
+    </w:p>
+    <w:p>
+      <w:r>
+        <w:t>Trying to add my fourth sentence…</w:t>
       </w:r>
     </w:p>
     <w:sectPr>

</xml_diff>

<commit_message>
Updating the word document for the repo
</commit_message>
<xml_diff>
--- a/GitHub Test One.docx
+++ b/GitHub Test One.docx
@@ -18,6 +18,16 @@
     <w:p>
       <w:r>
         <w:t>Trying to add my fourth sentence…</w:t>
+      </w:r>
+    </w:p>
+    <w:p>
+      <w:r>
+        <w:t>7-14-26</w:t>
+      </w:r>
+    </w:p>
+    <w:p>
+      <w:r>
+        <w:t>My first sentence of the day</w:t>
       </w:r>
     </w:p>
     <w:sectPr>

</xml_diff>

<commit_message>
Making a quick change for change 3
</commit_message>
<xml_diff>
--- a/GitHub Test One.docx
+++ b/GitHub Test One.docx
@@ -7,15 +7,7 @@
         <w:t xml:space="preserve">This is an example of a document </w:t>
       </w:r>
       <w:r>
-        <w:t xml:space="preserve">I will check into </w:t>
-      </w:r>
-      <w:proofErr w:type="spellStart"/>
-      <w:r>
-        <w:t>github</w:t>
-      </w:r>
-      <w:proofErr w:type="spellEnd"/>
-      <w:r>
-        <w:t>.</w:t>
+        <w:t>I will check into github.</w:t>
       </w:r>
     </w:p>
     <w:p>
@@ -46,6 +38,16 @@
     <w:p>
       <w:r>
         <w:t>I want these changes to be added</w:t>
+      </w:r>
+    </w:p>
+    <w:p>
+      <w:r>
+        <w:t>07-14-26 change 3</w:t>
+      </w:r>
+    </w:p>
+    <w:p>
+      <w:r>
+        <w:t>Trying to cover conflicts</w:t>
       </w:r>
     </w:p>
     <w:sectPr>

</xml_diff>

<commit_message>
Adding change 4 with 3
</commit_message>
<xml_diff>
--- a/GitHub Test One.docx
+++ b/GitHub Test One.docx
@@ -7,7 +7,15 @@
         <w:t xml:space="preserve">This is an example of a document </w:t>
       </w:r>
       <w:r>
-        <w:t>I will check into github.</w:t>
+        <w:t xml:space="preserve">I will check into </w:t>
+      </w:r>
+      <w:proofErr w:type="spellStart"/>
+      <w:r>
+        <w:t>github</w:t>
+      </w:r>
+      <w:proofErr w:type="spellEnd"/>
+      <w:r>
+        <w:t>.</w:t>
       </w:r>
     </w:p>
     <w:p>
@@ -50,6 +58,17 @@
         <w:t>Trying to cover conflicts</w:t>
       </w:r>
     </w:p>
+    <w:p>
+      <w:r>
+        <w:t>07-14-26 change 4</w:t>
+      </w:r>
+    </w:p>
+    <w:p>
+      <w:r>
+        <w:t>Trying to add my fourth change</w:t>
+      </w:r>
+    </w:p>
+    <w:p/>
     <w:sectPr>
       <w:pgSz w:w="12240" w:h="15840"/>
       <w:pgMar w:top="1440" w:right="1440" w:bottom="1440" w:left="1440" w:header="720" w:footer="720" w:gutter="0"/>

</xml_diff>

<commit_message>
Performing change to be captured in fetch
</commit_message>
<xml_diff>
--- a/GitHub Test One.docx
+++ b/GitHub Test One.docx
@@ -7,15 +7,7 @@
         <w:t xml:space="preserve">This is an example of a document </w:t>
       </w:r>
       <w:r>
-        <w:t xml:space="preserve">I will check into </w:t>
-      </w:r>
-      <w:proofErr w:type="spellStart"/>
-      <w:r>
-        <w:t>github</w:t>
-      </w:r>
-      <w:proofErr w:type="spellEnd"/>
-      <w:r>
-        <w:t>.</w:t>
+        <w:t>I will check into github.</w:t>
       </w:r>
     </w:p>
     <w:p>
@@ -66,6 +58,16 @@
     <w:p>
       <w:r>
         <w:t>Trying to add my fourth change</w:t>
+      </w:r>
+    </w:p>
+    <w:p>
+      <w:r>
+        <w:t>07-14-26 change 5</w:t>
+      </w:r>
+    </w:p>
+    <w:p>
+      <w:r>
+        <w:t>Perform a fetch to grab latest changes before I begin</w:t>
       </w:r>
     </w:p>
     <w:p/>

</xml_diff>